<commit_message>
docs: redact remaining Regeneron/STS references (methodology + project plan docx)
</commit_message>
<xml_diff>
--- a/enigma/ENIGMA_Project_Plan.docx
+++ b/enigma/ENIGMA_Project_Plan.docx
@@ -77,7 +77,7 @@
           <w:rFonts w:ascii="Calibri" w:hAnsi="Calibri"/>
           <w:sz w:val="22"/>
         </w:rPr>
-        <w:t>This plan covers the complete execution of the ENIGMA project across 10 phases and approximately 16 weeks. The project builds on existing completed work (Phases 1–7) and adds two novel analysis modules: temporal noise dynamics (Phase 8) and therapeutic noise quenching (Phase 9), plus updated figures (Phase 10). The plan is organized into four tracks: (A) existing completed work that serves as foundation, (B) new code additions for Phases 8–10, (C) analysis execution and figure generation, and (D) manuscript preparation and competition submission materials. Each week has explicit deliverables, time estimates, and dependency links to ensure the project remains on schedule for the Regeneron STS submission deadline.</w:t>
+        <w:t>This plan covers the complete execution of the ENIGMA project across 10 phases and approximately 16 weeks. The project builds on existing completed work (Phases 1–7) and adds two novel analysis modules: temporal noise dynamics (Phase 8) and therapeutic noise quenching (Phase 9), plus updated figures (Phase 10). The plan is organized into four tracks: (A) existing completed work that serves as foundation, (B) new code additions for Phases 8–10, (C) analysis execution and figure generation, and (D) manuscript preparation and competition submission materials. Each week has explicit deliverables, time estimates, and dependency links to ensure the project remains on schedule for the the project submission deadline.</w:t>
       </w:r>
     </w:p>
     <w:p>
@@ -5481,7 +5481,7 @@
                 <w:rFonts w:ascii="Calibri" w:hAnsi="Calibri"/>
                 <w:sz w:val="20"/>
               </w:rPr>
-              <w:t>Prepare Regeneron STS materials: 1-page project abstract, research report (20-page limit), common application essay edits.</w:t>
+              <w:t>Prepare the project materials: 1-page project abstract, research report (20-page limit), common application essay edits.</w:t>
             </w:r>
           </w:p>
         </w:tc>
@@ -5506,7 +5506,7 @@
                 <w:rFonts w:ascii="Calibri" w:hAnsi="Calibri"/>
                 <w:sz w:val="20"/>
               </w:rPr>
-              <w:t>STS abstract draft</w:t>
+              <w:t>competition abstract draft</w:t>
             </w:r>
           </w:p>
         </w:tc>
@@ -7519,7 +7519,7 @@
                 <w:rFonts w:ascii="Calibri" w:hAnsi="Calibri"/>
                 <w:sz w:val="20"/>
               </w:rPr>
-              <w:t>STS deadline pressure compresses final preparation time</w:t>
+              <w:t>competition deadline pressure compresses final preparation time</w:t>
             </w:r>
           </w:p>
         </w:tc>
@@ -14855,7 +14855,7 @@
           <w:color w:val="1A1A2E"/>
           <w:sz w:val="32"/>
         </w:rPr>
-        <w:t>8. COMPETITION TIMELINE (REGENERON STS)</w:t>
+        <w:t>8. COMPETITION TIMELINE (the project)</w:t>
       </w:r>
     </w:p>
     <w:p>
@@ -14864,7 +14864,7 @@
           <w:rFonts w:ascii="Calibri" w:hAnsi="Calibri"/>
           <w:sz w:val="22"/>
         </w:rPr>
-        <w:t>The Regeneron Science Talent Search has a November 2026 submission deadline. The following timeline maps project milestones to competition requirements, ensuring all materials are prepared with adequate buffer time.</w:t>
+        <w:t>The the science competition has a November 2026 submission deadline. The following timeline maps project milestones to competition requirements, ensuring all materials are prepared with adequate buffer time.</w:t>
       </w:r>
     </w:p>
     <w:tbl>
@@ -15419,7 +15419,7 @@
                 <w:rFonts w:ascii="Calibri" w:hAnsi="Calibri"/>
                 <w:sz w:val="20"/>
               </w:rPr>
-              <w:t>20-page STS format research report; adapted from manuscript for competition audience</w:t>
+              <w:t>20-page competition format research report; adapted from manuscript for competition audience</w:t>
             </w:r>
           </w:p>
         </w:tc>
@@ -15548,7 +15548,7 @@
                 <w:rFonts w:ascii="Calibri" w:hAnsi="Calibri"/>
                 <w:sz w:val="20"/>
               </w:rPr>
-              <w:t>STS submission</w:t>
+              <w:t>competition submission</w:t>
             </w:r>
           </w:p>
         </w:tc>
@@ -15573,7 +15573,7 @@
                 <w:rFonts w:ascii="Calibri" w:hAnsi="Calibri"/>
                 <w:sz w:val="20"/>
               </w:rPr>
-              <w:t>Research report, 1-page abstract, transcripts, teacher recommendation, Common App essay, all uploaded to STS portal</w:t>
+              <w:t>Research report, 1-page abstract, transcripts, teacher recommendation, Common App essay, all uploaded to competition portal</w:t>
             </w:r>
           </w:p>
         </w:tc>

</xml_diff>